<commit_message>
docs: add 5 full diagrams (Architecture, BFD, UCD, ERD, Activity) to report and docx
</commit_message>
<xml_diff>
--- a/docs/Bao_Cao_Do_An_IS402_AI_FDSS_Moi_Nhat.docx
+++ b/docs/Bao_Cao_Do_An_IS402_AI_FDSS_Moi_Nhat.docx
@@ -274,7 +274,7 @@
           <w:rFonts w:ascii="Times New Roman" w:hAnsi="Times New Roman"/>
           <w:sz w:val="23"/>
         </w:rPr>
-        <w:t xml:space="preserve">  1.4 Sơ đồ phân rã chức năng nghiệp vụ (BFD - Business Function Diagram)</w:t>
+        <w:t xml:space="preserve">  1.4 Sơ đồ phân rã chức năng nghiệp vụ (BFD - Hình 1.1)</w:t>
       </w:r>
     </w:p>
     <w:p>
@@ -298,7 +298,7 @@
           <w:rFonts w:ascii="Times New Roman" w:hAnsi="Times New Roman"/>
           <w:sz w:val="23"/>
         </w:rPr>
-        <w:t xml:space="preserve">  1.6 Sơ đồ Use Case tổng quát và kịch bản tương tác người dùng</w:t>
+        <w:t xml:space="preserve">  1.6 Sơ đồ Use Case tổng thể hệ thống (UCD - Hình 1.2) &amp; Kịch bản tương tác</w:t>
       </w:r>
     </w:p>
     <w:p>
@@ -323,7 +323,7 @@
           <w:rFonts w:ascii="Times New Roman" w:hAnsi="Times New Roman"/>
           <w:sz w:val="23"/>
         </w:rPr>
-        <w:t xml:space="preserve">  2.1 Quy trình Đánh giá sức khỏe tài chính &amp; Khẩu vị rủi ro (Mô hình phạt lỗi)</w:t>
+        <w:t xml:space="preserve">  2.1 Sơ đồ hoạt động tổng thể của toàn dự án (Overall Activity Workflow - Hình 2.1)</w:t>
       </w:r>
     </w:p>
     <w:p>
@@ -335,7 +335,7 @@
           <w:rFonts w:ascii="Times New Roman" w:hAnsi="Times New Roman"/>
           <w:sz w:val="23"/>
         </w:rPr>
-        <w:t xml:space="preserve">  2.2 Quy trình Quét &amp; Phát hiện chi tiêu bất thường (Anomaly Detection)</w:t>
+        <w:t xml:space="preserve">  2.2 Quy trình Đánh giá sức khỏe tài chính &amp; Khẩu vị rủi ro (Mô hình phạt lỗi)</w:t>
       </w:r>
     </w:p>
     <w:p>
@@ -347,7 +347,7 @@
           <w:rFonts w:ascii="Times New Roman" w:hAnsi="Times New Roman"/>
           <w:sz w:val="23"/>
         </w:rPr>
-        <w:t xml:space="preserve">  2.3 Quy trình Dự báo dòng tiền tương lai (Time-Series Cashflow Forecasting)</w:t>
+        <w:t xml:space="preserve">  2.3 Quy trình Quét &amp; Phát hiện chi tiêu bất thường (Anomaly Detection)</w:t>
       </w:r>
     </w:p>
     <w:p>
@@ -359,7 +359,7 @@
           <w:rFonts w:ascii="Times New Roman" w:hAnsi="Times New Roman"/>
           <w:sz w:val="23"/>
         </w:rPr>
-        <w:t xml:space="preserve">  2.4 Quy trình Mô phỏng kịch bản What-If &amp; Duyệt quyết định 1-Click</w:t>
+        <w:t xml:space="preserve">  2.4 Quy trình Dự báo dòng tiền tương lai (Time-Series Cashflow Forecasting)</w:t>
       </w:r>
     </w:p>
     <w:p>
@@ -371,7 +371,19 @@
           <w:rFonts w:ascii="Times New Roman" w:hAnsi="Times New Roman"/>
           <w:sz w:val="23"/>
         </w:rPr>
-        <w:t xml:space="preserve">  2.5 Quy trình Trợ lý ảo AI Copilot tương tác chuyên sâu qua kỹ thuật RAG</w:t>
+        <w:t xml:space="preserve">  2.5 Quy trình Mô phỏng kịch bản What-If &amp; Duyệt quyết định 1-Click</w:t>
+      </w:r>
+    </w:p>
+    <w:p>
+      <w:pPr>
+        <w:spacing w:line="276" w:lineRule="auto" w:after="40"/>
+      </w:pPr>
+      <w:r>
+        <w:rPr>
+          <w:rFonts w:ascii="Times New Roman" w:hAnsi="Times New Roman"/>
+          <w:sz w:val="23"/>
+        </w:rPr>
+        <w:t xml:space="preserve">  2.6 Quy trình Trợ lý ảo AI Copilot tương tác chuyên sâu qua kỹ thuật RAG</w:t>
       </w:r>
     </w:p>
     <w:p>
@@ -396,7 +408,7 @@
           <w:rFonts w:ascii="Times New Roman" w:hAnsi="Times New Roman"/>
           <w:sz w:val="23"/>
         </w:rPr>
-        <w:t xml:space="preserve">  3.1 Mô hình quan hệ thực thể (ERD 17 bảng trong MySQL 8.0)</w:t>
+        <w:t xml:space="preserve">  3.1 Sơ đồ quan hệ thực thể (ERD 17 bảng trong MySQL 8.0 - Hình 3.1)</w:t>
       </w:r>
     </w:p>
     <w:p>
@@ -518,7 +530,7 @@
           <w:rFonts w:ascii="Times New Roman" w:hAnsi="Times New Roman"/>
           <w:sz w:val="23"/>
         </w:rPr>
-        <w:t xml:space="preserve">  5.1 Kiến trúc công nghệ kết hợp (Electron 34 + React 19 + TypeScript + MySQL 8.0)</w:t>
+        <w:t xml:space="preserve">  5.1 Sơ đồ kiến trúc tổng thể hệ thống (System Architecture - Hình 5.1)</w:t>
       </w:r>
     </w:p>
     <w:p>
@@ -925,6 +937,49 @@
                 <w:b/>
                 <w:sz w:val="22"/>
               </w:rPr>
+              <w:t>UCD</w:t>
+            </w:r>
+          </w:p>
+        </w:tc>
+        <w:tc>
+          <w:tcPr>
+            <w:tcW w:type="dxa" w:w="6480"/>
+            <w:tcMar>
+              <w:top w:w="100" w:type="dxa"/>
+              <w:bottom w:w="100" w:type="dxa"/>
+              <w:left w:w="150" w:type="dxa"/>
+              <w:right w:w="150" w:type="dxa"/>
+            </w:tcMar>
+          </w:tcPr>
+          <w:p>
+            <w:r>
+              <w:rPr>
+                <w:rFonts w:ascii="Times New Roman" w:hAnsi="Times New Roman"/>
+                <w:sz w:val="22"/>
+              </w:rPr>
+              <w:t>Use Case Diagram - Sơ đồ trường hợp sử dụng tổng thể.</w:t>
+            </w:r>
+          </w:p>
+        </w:tc>
+      </w:tr>
+      <w:tr>
+        <w:tc>
+          <w:tcPr>
+            <w:tcW w:type="dxa" w:w="2592"/>
+            <w:tcMar>
+              <w:top w:w="100" w:type="dxa"/>
+              <w:bottom w:w="100" w:type="dxa"/>
+              <w:left w:w="150" w:type="dxa"/>
+              <w:right w:w="150" w:type="dxa"/>
+            </w:tcMar>
+          </w:tcPr>
+          <w:p>
+            <w:r>
+              <w:rPr>
+                <w:rFonts w:ascii="Times New Roman" w:hAnsi="Times New Roman"/>
+                <w:b/>
+                <w:sz w:val="22"/>
+              </w:rPr>
               <w:t>ERD</w:t>
             </w:r>
           </w:p>
@@ -1245,72 +1300,7 @@
           <w:i w:val="0"/>
           <w:sz w:val="24"/>
         </w:rPr>
-        <w:t>Mục tiêu 2 (Hiện thực hóa các bài toán DSS cốt lõi): Thiết kế và cài đặt thành công 5 năng lực hỗ trợ ra quyết định thông minh:</w:t>
-      </w:r>
-    </w:p>
-    <w:p>
-      <w:pPr>
-        <w:spacing w:after="60" w:line="288" w:lineRule="auto"/>
-      </w:pPr>
-      <w:r>
-        <w:rPr>
-          <w:rFonts w:ascii="Times New Roman" w:hAnsi="Times New Roman"/>
-          <w:i w:val="0"/>
-          <w:sz w:val="24"/>
-        </w:rPr>
-        <w:t xml:space="preserve">   • Đánh giá Điểm sức khỏe tài chính &amp; Khẩu vị rủi ro với mô hình trừ điểm vi phạm (thang 10 - 100).</w:t>
-      </w:r>
-    </w:p>
-    <w:p>
-      <w:pPr>
-        <w:spacing w:after="60" w:line="288" w:lineRule="auto"/>
-      </w:pPr>
-      <w:r>
-        <w:rPr>
-          <w:rFonts w:ascii="Times New Roman" w:hAnsi="Times New Roman"/>
-          <w:i w:val="0"/>
-          <w:sz w:val="24"/>
-        </w:rPr>
-        <w:t xml:space="preserve">   • Tự động quét và phát hiện giao dịch chi tiêu bất thường (Anomaly Detection) vượt ngưỡng 2.5 lần trung bình.</w:t>
-      </w:r>
-    </w:p>
-    <w:p>
-      <w:pPr>
-        <w:spacing w:after="60" w:line="288" w:lineRule="auto"/>
-      </w:pPr>
-      <w:r>
-        <w:rPr>
-          <w:rFonts w:ascii="Times New Roman" w:hAnsi="Times New Roman"/>
-          <w:i w:val="0"/>
-          <w:sz w:val="24"/>
-        </w:rPr>
-        <w:t xml:space="preserve">   • Dự báo dòng tiền tương lai 3 tháng với 3 kịch bản: Tích cực, Kỳ vọng và Thận trọng (Time-Series).</w:t>
-      </w:r>
-    </w:p>
-    <w:p>
-      <w:pPr>
-        <w:spacing w:after="60" w:line="288" w:lineRule="auto"/>
-      </w:pPr>
-      <w:r>
-        <w:rPr>
-          <w:rFonts w:ascii="Times New Roman" w:hAnsi="Times New Roman"/>
-          <w:i w:val="0"/>
-          <w:sz w:val="24"/>
-        </w:rPr>
-        <w:t xml:space="preserve">   • Mô phỏng kịch bản giả định What-If đối soát khả năng thanh toán trước các quyết định mua sắm lớn / trả góp.</w:t>
-      </w:r>
-    </w:p>
-    <w:p>
-      <w:pPr>
-        <w:spacing w:after="60" w:line="288" w:lineRule="auto"/>
-      </w:pPr>
-      <w:r>
-        <w:rPr>
-          <w:rFonts w:ascii="Times New Roman" w:hAnsi="Times New Roman"/>
-          <w:i w:val="0"/>
-          <w:sz w:val="24"/>
-        </w:rPr>
-        <w:t xml:space="preserve">   • Trợ lý ảo cố vấn tài chính AI Copilot tương tác tự nhiên theo ngữ cảnh dữ liệu thực tế (kỹ thuật RAG).</w:t>
+        <w:t>Mục tiêu 2 (Hiện thực hóa các bài toán DSS cốt lõi): Thiết kế và cài đặt thành công 5 năng lực hỗ trợ ra quyết định thông minh: Đánh giá sức khỏe tài chính (thang điểm 10-100), Quét chi tiêu bất thường (&gt;2.5x trung bình), Dự báo dòng tiền 3 tháng (Time-Series), Mô phỏng What-If mua sắm tài sản lớn, Trợ lý AI Copilot tương tác tự nhiên (RAG).</w:t>
       </w:r>
     </w:p>
     <w:p>
@@ -1712,75 +1702,63 @@
           <w:i w:val="0"/>
           <w:sz w:val="24"/>
         </w:rPr>
-        <w:t>Hệ thống được thiết kế theo cấu trúc phân rã chuẩn gồm 6 Module nghiệp vụ chính:</w:t>
+        <w:t>Hệ thống được thiết kế theo cấu trúc phân rã chuẩn gồm 6 Module nghiệp vụ chính. Sơ đồ hình cây BFD dưới đây minh họa toàn bộ các chức năng từ cấp hệ thống (0.0) xuống các chức năng con chi tiết:</w:t>
       </w:r>
     </w:p>
     <w:p>
       <w:pPr>
-        <w:spacing w:before="80" w:after="120" w:line="252" w:lineRule="auto"/>
-        <w:ind w:left="288"/>
+        <w:spacing w:before="160" w:after="80"/>
+        <w:jc w:val="center"/>
+      </w:pPr>
+      <w:r>
+        <w:drawing>
+          <wp:inline xmlns:a="http://schemas.openxmlformats.org/drawingml/2006/main" xmlns:pic="http://schemas.openxmlformats.org/drawingml/2006/picture">
+            <wp:extent cx="5669280" cy="3848869"/>
+            <wp:docPr id="1" name="Picture 1"/>
+            <wp:cNvGraphicFramePr>
+              <a:graphicFrameLocks noChangeAspect="1"/>
+            </wp:cNvGraphicFramePr>
+            <a:graphic>
+              <a:graphicData uri="http://schemas.openxmlformats.org/drawingml/2006/picture">
+                <pic:pic>
+                  <pic:nvPicPr>
+                    <pic:cNvPr id="0" name="2_bfd_diagram.png"/>
+                    <pic:cNvPicPr/>
+                  </pic:nvPicPr>
+                  <pic:blipFill>
+                    <a:blip r:embed="rId9"/>
+                    <a:stretch>
+                      <a:fillRect/>
+                    </a:stretch>
+                  </pic:blipFill>
+                  <pic:spPr>
+                    <a:xfrm>
+                      <a:off x="0" y="0"/>
+                      <a:ext cx="5669280" cy="3848869"/>
+                    </a:xfrm>
+                    <a:prstGeom prst="rect"/>
+                  </pic:spPr>
+                </pic:pic>
+              </a:graphicData>
+            </a:graphic>
+          </wp:inline>
+        </w:drawing>
+      </w:r>
+    </w:p>
+    <w:p>
+      <w:pPr>
+        <w:spacing w:after="200"/>
+        <w:jc w:val="center"/>
       </w:pPr>
       <w:r>
         <w:rPr>
-          <w:rFonts w:ascii="Consolas" w:hAnsi="Consolas"/>
-          <w:color w:val="1E293B"/>
-          <w:sz w:val="19"/>
+          <w:rFonts w:ascii="Times New Roman" w:hAnsi="Times New Roman"/>
+          <w:b/>
+          <w:i/>
+          <w:color w:val="323232"/>
+          <w:sz w:val="21"/>
         </w:rPr>
-        <w:t>0.0 HỆ THỐNG HỖ TRỢ RA QUYẾT ĐỊNH TÀI CHÍNH CÁ NHÂN (AI-FDSS)</w:t>
-        <w:br/>
-        <w:t>├── 1.0 Quản lý Thu Chi &amp; Dòng tiền</w:t>
-        <w:br/>
-        <w:t>│   ├── 1.1 Quản lý danh sách ví &amp; tài khoản ngân hàng</w:t>
-        <w:br/>
-        <w:t>│   ├── 1.2 Quản lý danh mục thu/chi đa cấp</w:t>
-        <w:br/>
-        <w:t>│   ├── 1.3 Ghi chép và truy vấn lịch sử giao dịch</w:t>
-        <w:br/>
-        <w:t>│   └── 1.4 Lên lịch giao dịch tự động định kỳ</w:t>
-        <w:br/>
-        <w:t>├── 2.0 Quản lý Ngân sách &amp; Tiết kiệm</w:t>
-        <w:br/>
-        <w:t>│   ├── 2.1 Thiết lập định mức ngân sách hàng tháng</w:t>
-        <w:br/>
-        <w:t>│   ├── 2.2 Giám sát tiến độ giải ngân &amp; cảnh báo vượt ngưỡng</w:t>
-        <w:br/>
-        <w:t>│   └── 2.3 Quản lý mục tiêu tích lũy tài chính</w:t>
-        <w:br/>
-        <w:t>├── 3.0 Quản lý Sổ Công nợ Cá nhân</w:t>
-        <w:br/>
-        <w:t>│   ├── 3.1 Theo dõi nợ 2 chiều (Tôi nợ người khác / Người khác nợ tôi)</w:t>
-        <w:br/>
-        <w:t>│   ├── 3.2 Ghi nhận các đợt thanh toán nợ từng phần</w:t>
-        <w:br/>
-        <w:t>│   └── 3.3 Nhắc nhở nợ đến hạn và tính toán nợ xấu</w:t>
-        <w:br/>
-        <w:t>├── 4.0 Báo cáo &amp; Phân tích Trực quan</w:t>
-        <w:br/>
-        <w:t>│   ├── 4.1 Bảng điều khiển tổng quan KPI Dashboard</w:t>
-        <w:br/>
-        <w:t>│   ├── 4.2 Biểu đồ cơ cấu danh mục chi tiêu &amp; xu hướng thu chi</w:t>
-        <w:br/>
-        <w:t>│   └── 4.3 Trích xuất báo cáo dữ liệu định dạng CSV</w:t>
-        <w:br/>
-        <w:t>├── 5.0 Hỗ trợ Ra quyết định bằng AI (TRỌNG TÂM DSS)</w:t>
-        <w:br/>
-        <w:t>│   ├── 5.1 Đánh giá Điểm sức khỏe tài chính &amp; Khẩu vị rủi ro</w:t>
-        <w:br/>
-        <w:t>│   ├── 5.2 Tự động quét và phát hiện chi tiêu bất thường</w:t>
-        <w:br/>
-        <w:t>│   ├── 5.3 Dự báo dòng tiền tương lai 3 tháng (Time-Series)</w:t>
-        <w:br/>
-        <w:t>│   ├── 5.4 Mô phỏng kịch bản What-If mua sắm tài sản lớn</w:t>
-        <w:br/>
-        <w:t>│   ├── 5.5 Đưa ra khuyến nghị can thiệp &amp; Phê duyệt 1-Click</w:t>
-        <w:br/>
-        <w:t>│   └── 5.6 Trợ lý ảo cố vấn tài chính AI Copilot (RAG)</w:t>
-        <w:br/>
-        <w:t>└── 6.0 Cài đặt &amp; Tiện ích Quản trị</w:t>
-        <w:br/>
-        <w:t xml:space="preserve">    ├── 6.1 Tùy chọn mô hình AI (Gemini 2.5 Flash / Flash Latest)</w:t>
-        <w:br/>
-        <w:t xml:space="preserve">    └── 6.2 Kiểm tra kết nối CSDL và sao lưu dữ liệu</w:t>
+        <w:t>Hình 1.1: Sơ đồ phân rã chức năng nghiệp vụ (BFD - Business Function Diagram)</w:t>
       </w:r>
     </w:p>
     <w:p>
@@ -2415,6 +2393,117 @@
     </w:tbl>
     <w:p>
       <w:pPr>
+        <w:pStyle w:val="Heading2"/>
+        <w:keepNext/>
+        <w:spacing w:before="280" w:after="120"/>
+      </w:pPr>
+      <w:r>
+        <w:rPr>
+          <w:rFonts w:ascii="Times New Roman" w:hAnsi="Times New Roman"/>
+          <w:b/>
+          <w:color w:val="1C508C"/>
+          <w:sz w:val="27"/>
+        </w:rPr>
+        <w:t>1.6 Sơ Đồ Use Case Tổng Thể Hệ Thống (UCD) &amp; Kịch Bản Tương Tác</w:t>
+      </w:r>
+    </w:p>
+    <w:p>
+      <w:pPr>
+        <w:spacing w:after="80" w:line="288" w:lineRule="auto"/>
+      </w:pPr>
+      <w:r>
+        <w:rPr>
+          <w:rFonts w:ascii="Times New Roman" w:hAnsi="Times New Roman"/>
+          <w:i w:val="0"/>
+          <w:sz w:val="24"/>
+        </w:rPr>
+        <w:t>Sơ đồ Use Case tổng thể xác định ranh giới hệ thống, các tác nhân (Actors) và các trường hợp sử dụng trọng tâm:</w:t>
+      </w:r>
+    </w:p>
+    <w:p>
+      <w:pPr>
+        <w:spacing w:after="80" w:line="288" w:lineRule="auto"/>
+      </w:pPr>
+      <w:r>
+        <w:rPr>
+          <w:rFonts w:ascii="Times New Roman" w:hAnsi="Times New Roman"/>
+          <w:i w:val="0"/>
+          <w:sz w:val="24"/>
+        </w:rPr>
+        <w:t>• Tác nhân chính (Primary Actor): Người dùng cá nhân – người trực tiếp nhập liệu, xem báo cáo và thực hiện các quyết định tài chính.</w:t>
+      </w:r>
+    </w:p>
+    <w:p>
+      <w:pPr>
+        <w:spacing w:after="80" w:line="288" w:lineRule="auto"/>
+      </w:pPr>
+      <w:r>
+        <w:rPr>
+          <w:rFonts w:ascii="Times New Roman" w:hAnsi="Times New Roman"/>
+          <w:i w:val="0"/>
+          <w:sz w:val="24"/>
+        </w:rPr>
+        <w:t>• Tác nhân phụ (Secondary / External System): Google Gemini AI – động cơ trí tuệ nhân tạo bên ngoài đóng vai trò xử lý ngôn ngữ tự nhiên, lập luận logic và sinh kịch bản khuyến nghị.</w:t>
+      </w:r>
+    </w:p>
+    <w:p>
+      <w:pPr>
+        <w:spacing w:before="160" w:after="80"/>
+        <w:jc w:val="center"/>
+      </w:pPr>
+      <w:r>
+        <w:drawing>
+          <wp:inline xmlns:a="http://schemas.openxmlformats.org/drawingml/2006/main" xmlns:pic="http://schemas.openxmlformats.org/drawingml/2006/picture">
+            <wp:extent cx="5669280" cy="4004904"/>
+            <wp:docPr id="2" name="Picture 2"/>
+            <wp:cNvGraphicFramePr>
+              <a:graphicFrameLocks noChangeAspect="1"/>
+            </wp:cNvGraphicFramePr>
+            <a:graphic>
+              <a:graphicData uri="http://schemas.openxmlformats.org/drawingml/2006/picture">
+                <pic:pic>
+                  <pic:nvPicPr>
+                    <pic:cNvPr id="0" name="3_ucd_diagram.png"/>
+                    <pic:cNvPicPr/>
+                  </pic:nvPicPr>
+                  <pic:blipFill>
+                    <a:blip r:embed="rId10"/>
+                    <a:stretch>
+                      <a:fillRect/>
+                    </a:stretch>
+                  </pic:blipFill>
+                  <pic:spPr>
+                    <a:xfrm>
+                      <a:off x="0" y="0"/>
+                      <a:ext cx="5669280" cy="4004904"/>
+                    </a:xfrm>
+                    <a:prstGeom prst="rect"/>
+                  </pic:spPr>
+                </pic:pic>
+              </a:graphicData>
+            </a:graphic>
+          </wp:inline>
+        </w:drawing>
+      </w:r>
+    </w:p>
+    <w:p>
+      <w:pPr>
+        <w:spacing w:after="200"/>
+        <w:jc w:val="center"/>
+      </w:pPr>
+      <w:r>
+        <w:rPr>
+          <w:rFonts w:ascii="Times New Roman" w:hAnsi="Times New Roman"/>
+          <w:b/>
+          <w:i/>
+          <w:color w:val="323232"/>
+          <w:sz w:val="21"/>
+        </w:rPr>
+        <w:t>Hình 1.2: Sơ đồ Use Case tổng thể hệ thống (Use Case Diagram - UCD)</w:t>
+      </w:r>
+    </w:p>
+    <w:p>
+      <w:pPr>
         <w:pStyle w:val="Heading1"/>
         <w:keepNext/>
         <w:spacing w:before="280" w:after="120"/>
@@ -2439,7 +2528,7 @@
           <w:i w:val="0"/>
           <w:sz w:val="24"/>
         </w:rPr>
-        <w:t>Chương này mô tả chi tiết 5 lưu đồ quy trình ra quyết định được hiện thực hóa trong mã nguồn hệ thống.</w:t>
+        <w:t>Chương này mô tả sơ đồ hoạt động tổng thể của toàn dự án và 5 lưu đồ quy trình nghiệp vụ DSS cốt lõi.</w:t>
       </w:r>
     </w:p>
     <w:p>
@@ -2455,7 +2544,92 @@
           <w:color w:val="1C508C"/>
           <w:sz w:val="27"/>
         </w:rPr>
-        <w:t>2.1 Lưu đồ Quy trình Đánh giá Sức khỏe Tài chính (Penalty Model)</w:t>
+        <w:t>2.1 Sơ Đồ Hoạt Động Tổng Thể Của Toàn Dự Án (Overall Activity Workflow)</w:t>
+      </w:r>
+    </w:p>
+    <w:p>
+      <w:pPr>
+        <w:spacing w:after="80" w:line="288" w:lineRule="auto"/>
+      </w:pPr>
+      <w:r>
+        <w:rPr>
+          <w:rFonts w:ascii="Times New Roman" w:hAnsi="Times New Roman"/>
+          <w:i w:val="0"/>
+          <w:sz w:val="24"/>
+        </w:rPr>
+        <w:t>Sơ đồ hoạt động dưới đây mô tả trọn vẹn chu trình vận hành từ lúc người dùng khởi động ứng dụng, cơ chế tự động kiểm tra CSDL (Zero-Config), tải dữ liệu lên Dashboard, phân luồng xử lý song song các tác vụ TPS &amp; DSS, cho đến khi vấn đáp cùng Trợ lý ảo AI Copilot:</w:t>
+      </w:r>
+    </w:p>
+    <w:p>
+      <w:pPr>
+        <w:spacing w:before="160" w:after="80"/>
+        <w:jc w:val="center"/>
+      </w:pPr>
+      <w:r>
+        <w:drawing>
+          <wp:inline xmlns:a="http://schemas.openxmlformats.org/drawingml/2006/main" xmlns:pic="http://schemas.openxmlformats.org/drawingml/2006/picture">
+            <wp:extent cx="5669280" cy="4108928"/>
+            <wp:docPr id="3" name="Picture 3"/>
+            <wp:cNvGraphicFramePr>
+              <a:graphicFrameLocks noChangeAspect="1"/>
+            </wp:cNvGraphicFramePr>
+            <a:graphic>
+              <a:graphicData uri="http://schemas.openxmlformats.org/drawingml/2006/picture">
+                <pic:pic>
+                  <pic:nvPicPr>
+                    <pic:cNvPr id="0" name="5_overall_activity.png"/>
+                    <pic:cNvPicPr/>
+                  </pic:nvPicPr>
+                  <pic:blipFill>
+                    <a:blip r:embed="rId11"/>
+                    <a:stretch>
+                      <a:fillRect/>
+                    </a:stretch>
+                  </pic:blipFill>
+                  <pic:spPr>
+                    <a:xfrm>
+                      <a:off x="0" y="0"/>
+                      <a:ext cx="5669280" cy="4108928"/>
+                    </a:xfrm>
+                    <a:prstGeom prst="rect"/>
+                  </pic:spPr>
+                </pic:pic>
+              </a:graphicData>
+            </a:graphic>
+          </wp:inline>
+        </w:drawing>
+      </w:r>
+    </w:p>
+    <w:p>
+      <w:pPr>
+        <w:spacing w:after="200"/>
+        <w:jc w:val="center"/>
+      </w:pPr>
+      <w:r>
+        <w:rPr>
+          <w:rFonts w:ascii="Times New Roman" w:hAnsi="Times New Roman"/>
+          <w:b/>
+          <w:i/>
+          <w:color w:val="323232"/>
+          <w:sz w:val="21"/>
+        </w:rPr>
+        <w:t>Hình 2.1: Sơ đồ hoạt động và luồng xử lý tổng thể của toàn dự án (Overall Activity Diagram)</w:t>
+      </w:r>
+    </w:p>
+    <w:p>
+      <w:pPr>
+        <w:pStyle w:val="Heading2"/>
+        <w:keepNext/>
+        <w:spacing w:before="280" w:after="120"/>
+      </w:pPr>
+      <w:r>
+        <w:rPr>
+          <w:rFonts w:ascii="Times New Roman" w:hAnsi="Times New Roman"/>
+          <w:b/>
+          <w:color w:val="1C508C"/>
+          <w:sz w:val="27"/>
+        </w:rPr>
+        <w:t>2.2 Lưu Đồ Quy Trình Đánh Giá Sức Khỏe Tài Chính (Penalty Model)</w:t>
       </w:r>
     </w:p>
     <w:p>
@@ -2601,7 +2775,7 @@
           <w:color w:val="1C508C"/>
           <w:sz w:val="27"/>
         </w:rPr>
-        <w:t>2.2 Lưu đồ Quy trình Phát hiện Chi tiêu Bất thường (Anomaly Detection)</w:t>
+        <w:t>2.3 Lưu Đồ Quy Trình Phát Hiện Chi Tiêu Bất Thường (Anomaly Detection)</w:t>
       </w:r>
     </w:p>
     <w:p>
@@ -2708,7 +2882,7 @@
           <w:color w:val="1C508C"/>
           <w:sz w:val="27"/>
         </w:rPr>
-        <w:t>2.3 Lưu đồ Quy trình Mô phỏng Kịch bản What-If &amp; Duyệt Quyết định 1-Click</w:t>
+        <w:t>2.4 Lưu Đồ Quy Trình Mô Phỏng Kịch Bản What-If &amp; Duyệt Quyết Định 1-Click</w:t>
       </w:r>
     </w:p>
     <w:p>
@@ -2815,7 +2989,7 @@
           <w:i w:val="0"/>
           <w:sz w:val="24"/>
         </w:rPr>
-        <w:t>Hệ thống triển khai Cơ sở dữ liệu quan hệ MySQL 8.0 với 17 bảng được chuẩn hóa, chia thành 2 phân hệ rõ rệt:</w:t>
+        <w:t>Hệ thống triển khai Cơ sở dữ liệu quan hệ MySQL 8.0 với 17 bảng được chuẩn hóa 3NF, chia thành 2 phân hệ rõ rệt:</w:t>
       </w:r>
     </w:p>
     <w:p>
@@ -2831,7 +3005,92 @@
           <w:color w:val="1C508C"/>
           <w:sz w:val="27"/>
         </w:rPr>
-        <w:t>3.1 Bảng Danh Mục 17 Bảng Dữ Liệu Trong Hệ Thống</w:t>
+        <w:t>3.1 Sơ Đồ Quan Hệ Thực Thể (ERD 17 Bảng CSDL MySQL 8.0)</w:t>
+      </w:r>
+    </w:p>
+    <w:p>
+      <w:pPr>
+        <w:spacing w:after="80" w:line="288" w:lineRule="auto"/>
+      </w:pPr>
+      <w:r>
+        <w:rPr>
+          <w:rFonts w:ascii="Times New Roman" w:hAnsi="Times New Roman"/>
+          <w:i w:val="0"/>
+          <w:sz w:val="24"/>
+        </w:rPr>
+        <w:t>Sơ đồ thực thể liên kết ERD dưới đây mô tả chi tiết quan hệ giữa 9 bảng thuộc phân hệ Nghiệp vụ Tài chính Core (xanh dương) và 8 bảng thuộc phân hệ Hỗ trợ ra quyết định &amp; AI Engine (tím):</w:t>
+      </w:r>
+    </w:p>
+    <w:p>
+      <w:pPr>
+        <w:spacing w:before="160" w:after="80"/>
+        <w:jc w:val="center"/>
+      </w:pPr>
+      <w:r>
+        <w:drawing>
+          <wp:inline xmlns:a="http://schemas.openxmlformats.org/drawingml/2006/main" xmlns:pic="http://schemas.openxmlformats.org/drawingml/2006/picture">
+            <wp:extent cx="5669280" cy="3928712"/>
+            <wp:docPr id="4" name="Picture 4"/>
+            <wp:cNvGraphicFramePr>
+              <a:graphicFrameLocks noChangeAspect="1"/>
+            </wp:cNvGraphicFramePr>
+            <a:graphic>
+              <a:graphicData uri="http://schemas.openxmlformats.org/drawingml/2006/picture">
+                <pic:pic>
+                  <pic:nvPicPr>
+                    <pic:cNvPr id="0" name="4_erd_diagram.png"/>
+                    <pic:cNvPicPr/>
+                  </pic:nvPicPr>
+                  <pic:blipFill>
+                    <a:blip r:embed="rId12"/>
+                    <a:stretch>
+                      <a:fillRect/>
+                    </a:stretch>
+                  </pic:blipFill>
+                  <pic:spPr>
+                    <a:xfrm>
+                      <a:off x="0" y="0"/>
+                      <a:ext cx="5669280" cy="3928712"/>
+                    </a:xfrm>
+                    <a:prstGeom prst="rect"/>
+                  </pic:spPr>
+                </pic:pic>
+              </a:graphicData>
+            </a:graphic>
+          </wp:inline>
+        </w:drawing>
+      </w:r>
+    </w:p>
+    <w:p>
+      <w:pPr>
+        <w:spacing w:after="200"/>
+        <w:jc w:val="center"/>
+      </w:pPr>
+      <w:r>
+        <w:rPr>
+          <w:rFonts w:ascii="Times New Roman" w:hAnsi="Times New Roman"/>
+          <w:b/>
+          <w:i/>
+          <w:color w:val="323232"/>
+          <w:sz w:val="21"/>
+        </w:rPr>
+        <w:t>Hình 3.1: Sơ đồ quan hệ thực thể (ERD 17 bảng trong MySQL 8.0 chuẩn 3NF)</w:t>
+      </w:r>
+    </w:p>
+    <w:p>
+      <w:pPr>
+        <w:pStyle w:val="Heading2"/>
+        <w:keepNext/>
+        <w:spacing w:before="280" w:after="120"/>
+      </w:pPr>
+      <w:r>
+        <w:rPr>
+          <w:rFonts w:ascii="Times New Roman" w:hAnsi="Times New Roman"/>
+          <w:b/>
+          <w:color w:val="1C508C"/>
+          <w:sz w:val="27"/>
+        </w:rPr>
+        <w:t>3.2 Bảng Danh Mục 17 Bảng Dữ Liệu Trong Hệ Thống</w:t>
       </w:r>
     </w:p>
     <w:tbl>
@@ -4353,7 +4612,7 @@
           <w:color w:val="1C508C"/>
           <w:sz w:val="27"/>
         </w:rPr>
-        <w:t>3.2 Các Câu Lệnh SQL Đặc Trưng Phục Vụ Hỗ Trợ Ra Quyết Định (Yêu cầu 6)</w:t>
+        <w:t>3.3 Các Câu Lệnh SQL Đặc Trưng Phục Vụ Hỗ Trợ Ra Quyết Định (Yêu cầu 6)</w:t>
       </w:r>
     </w:p>
     <w:p>
@@ -4490,7 +4749,7 @@
           <w:color w:val="1C508C"/>
           <w:sz w:val="27"/>
         </w:rPr>
-        <w:t>3.3 Tính Năng Tự Động Khởi Tạo CSDL Khi Sang Máy Mới (Zero-Config)</w:t>
+        <w:t>3.4 Tính Năng Tự Động Khởi Tạo CSDL Khi Sang Máy Mới (Zero-Config)</w:t>
       </w:r>
     </w:p>
     <w:p>
@@ -4797,7 +5056,7 @@
           <w:color w:val="1C508C"/>
           <w:sz w:val="27"/>
         </w:rPr>
-        <w:t>5.1 Ngăn Xếp Công Nghệ (Technology Stack)</w:t>
+        <w:t>5.1 Sơ Đồ Kiến Trúc Tổng Thể Hệ Thống (System Architecture)</w:t>
       </w:r>
     </w:p>
     <w:p>
@@ -4810,7 +5069,7 @@
           <w:i w:val="0"/>
           <w:sz w:val="24"/>
         </w:rPr>
-        <w:t>• Khung ứng dụng Desktop: Electron v34.3.0.</w:t>
+        <w:t>Hệ thống được thiết kế theo kiến trúc 3 tầng (3-Tier Desktop Hybrid Architecture) đảm bảo tính mở rộng, hiệu năng cao và phân tách rõ ràng trách nhiệm:</w:t>
       </w:r>
     </w:p>
     <w:p>
@@ -4823,7 +5082,7 @@
           <w:i w:val="0"/>
           <w:sz w:val="24"/>
         </w:rPr>
-        <w:t>• Frontend: React 19, TypeScript, Tailwind CSS, Lucide React Icons, Recharts.</w:t>
+        <w:t>• Tầng Giao diện Người dùng (Presentation Layer): Xây dựng bằng React 19, Vite và Tailwind CSS, tích hợp biểu đồ Recharts và các components tương tác.</w:t>
       </w:r>
     </w:p>
     <w:p>
@@ -4836,7 +5095,7 @@
           <w:i w:val="0"/>
           <w:sz w:val="24"/>
         </w:rPr>
-        <w:t>• Backend &amp; CSDL: Node.js, Electron IPC, MySQL 8.0 với thư viện `mysql2/promise`.</w:t>
+        <w:t>• Tầng Điều hành &amp; Nghiệp vụ (Application &amp; Logic Layer): Chạy trên Node.js và Electron Main Process, xử lý IPC routing bảo mật, thuật toán chấm điểm DSS và bộ lọc Anomaly Scanner.</w:t>
       </w:r>
     </w:p>
     <w:p>
@@ -4849,20 +5108,63 @@
           <w:i w:val="0"/>
           <w:sz w:val="24"/>
         </w:rPr>
-        <w:t>• Trí tuệ Nhân tạo: Google Gemini API (Gemini 2.5 Flash / Flash Latest).</w:t>
+        <w:t>• Tầng Dữ liệu &amp; Động cơ AI (Data &amp; AI Layer): CSDL MySQL Server 8.0 cục bộ lưu trữ an toàn kết hợp Google Gemini AI Cloud API qua kỹ thuật RAG.</w:t>
       </w:r>
     </w:p>
     <w:p>
       <w:pPr>
-        <w:spacing w:after="80" w:line="288" w:lineRule="auto"/>
+        <w:spacing w:before="160" w:after="80"/>
+        <w:jc w:val="center"/>
+      </w:pPr>
+      <w:r>
+        <w:drawing>
+          <wp:inline xmlns:a="http://schemas.openxmlformats.org/drawingml/2006/main" xmlns:pic="http://schemas.openxmlformats.org/drawingml/2006/picture">
+            <wp:extent cx="5669280" cy="3848869"/>
+            <wp:docPr id="5" name="Picture 5"/>
+            <wp:cNvGraphicFramePr>
+              <a:graphicFrameLocks noChangeAspect="1"/>
+            </wp:cNvGraphicFramePr>
+            <a:graphic>
+              <a:graphicData uri="http://schemas.openxmlformats.org/drawingml/2006/picture">
+                <pic:pic>
+                  <pic:nvPicPr>
+                    <pic:cNvPr id="0" name="1_system_architecture.png"/>
+                    <pic:cNvPicPr/>
+                  </pic:nvPicPr>
+                  <pic:blipFill>
+                    <a:blip r:embed="rId13"/>
+                    <a:stretch>
+                      <a:fillRect/>
+                    </a:stretch>
+                  </pic:blipFill>
+                  <pic:spPr>
+                    <a:xfrm>
+                      <a:off x="0" y="0"/>
+                      <a:ext cx="5669280" cy="3848869"/>
+                    </a:xfrm>
+                    <a:prstGeom prst="rect"/>
+                  </pic:spPr>
+                </pic:pic>
+              </a:graphicData>
+            </a:graphic>
+          </wp:inline>
+        </w:drawing>
+      </w:r>
+    </w:p>
+    <w:p>
+      <w:pPr>
+        <w:spacing w:after="200"/>
+        <w:jc w:val="center"/>
       </w:pPr>
       <w:r>
         <w:rPr>
           <w:rFonts w:ascii="Times New Roman" w:hAnsi="Times New Roman"/>
-          <w:i w:val="0"/>
-          <w:sz w:val="24"/>
+          <w:b/>
+          <w:i/>
+          <w:color w:val="323232"/>
+          <w:sz w:val="21"/>
         </w:rPr>
-        <w:t>• Cơ chế bảo mật: API Key được quản lý an toàn qua IPC backend, không để lộ trên UI của người dùng.</w:t>
+        <w:t>Hình 5.1: Sơ đồ kiến trúc 3 tầng tổng thể của hệ thống AI-FDSS</w:t>
       </w:r>
     </w:p>
     <w:p>
@@ -4920,7 +5222,7 @@
           <w:color w:val="102C57"/>
           <w:sz w:val="30"/>
         </w:rPr>
-        <w:t>CHƯƠNG 6: KẾ HOẠCH TRIỂN KHAI SPRINT &amp; PHÂN CÔNG 5 THÀNH VIÊN</w:t>
+        <w:t>CHƯƠNG 6: QUẢN LÝ DỰ ÁN THEO PHƯƠNG PHÁP LUẬN AGILE/SCRUM</w:t>
       </w:r>
     </w:p>
     <w:p>

</xml_diff>